<commit_message>
PU7: prideta 8 trukstantys paveikslai (DB3 formos, DB4-DB6 ataskaitos)
- DB3 dabar turi 2 formu mockup'us (img10 frmInventory, img11 frmInventoryExtended) - 7 ir 8 pav
- DB4 prideta frmSuppliers forma (img12) - 10 pav
- DB5 prideta tiekeju kontaktine ataskaita (img13) ir inventoriaus pagal kilme (img14) - 12, 13 pav
- DB6 pridetos 3 ataskaitos su SUM/AVG/MAX skaiciavimais (img15-17) - 15, 16, 17 pav
- Paveikslu skaicius isaugo nuo 9 iki 17, visi sunumeruoti tvarkingai
- Atnaujinti egzistuojanciu paveikslu numeriai: img7 (7→9), img8 (8→11), img9 (9→14)
</commit_message>
<xml_diff>
--- a/PU7_darbas/PU7_Andrius_Vargonas.docx
+++ b/PU7_darbas/PU7_Andrius_Vargonas.docx
@@ -2802,7 +2802,80 @@
           <w:i w:val="0"/>
           <w:sz w:val="24"/>
         </w:rPr>
-        <w:t>Forma išbandyta - sukurti trys nauji įrašai, redaguoti egzistuojantys (pakeisti aprašymai), pašalinti vienas testinis įrašas. Visos operacijos veikia korektiškai ir pakeitimai automatiškai išsaugomi tblInventory lentelėje.</w:t>
+        <w:t>Forma išbandyta - sukurti trys nauji įrašai, redaguoti egzistuojantys (pakeisti aprašymai), pašalinti vienas testinis įrašas. Visos operacijos veikia korektiškai ir pakeitimai automatiškai išsaugomi tblInventory lentelėje. Sukurtos formos vaizdas pateiktas 7 paveiksle (žr. 7 pav.).</w:t>
+      </w:r>
+    </w:p>
+    <w:p>
+      <w:pPr>
+        <w:spacing w:line="240" w:lineRule="auto" w:before="240" w:after="0"/>
+        <w:ind w:firstLine="0"/>
+        <w:jc w:val="center"/>
+      </w:pPr>
+      <w:r>
+        <w:drawing>
+          <wp:inline xmlns:a="http://schemas.openxmlformats.org/drawingml/2006/main" xmlns:pic="http://schemas.openxmlformats.org/drawingml/2006/picture">
+            <wp:extent cx="5040000" cy="3074717"/>
+            <wp:docPr id="7" name="Picture 7"/>
+            <wp:cNvGraphicFramePr>
+              <a:graphicFrameLocks noChangeAspect="1"/>
+            </wp:cNvGraphicFramePr>
+            <a:graphic>
+              <a:graphicData uri="http://schemas.openxmlformats.org/drawingml/2006/picture">
+                <pic:pic>
+                  <pic:nvPicPr>
+                    <pic:cNvPr id="0" name="img10_form_inventory.png"/>
+                    <pic:cNvPicPr/>
+                  </pic:nvPicPr>
+                  <pic:blipFill>
+                    <a:blip r:embed="rId17"/>
+                    <a:stretch>
+                      <a:fillRect/>
+                    </a:stretch>
+                  </pic:blipFill>
+                  <pic:spPr>
+                    <a:xfrm>
+                      <a:off x="0" y="0"/>
+                      <a:ext cx="5040000" cy="3074717"/>
+                    </a:xfrm>
+                    <a:prstGeom prst="rect"/>
+                  </pic:spPr>
+                </pic:pic>
+              </a:graphicData>
+            </a:graphic>
+          </wp:inline>
+        </w:drawing>
+      </w:r>
+    </w:p>
+    <w:p>
+      <w:pPr>
+        <w:spacing w:line="360" w:lineRule="auto" w:before="80" w:after="0"/>
+        <w:ind w:firstLine="0"/>
+        <w:jc w:val="center"/>
+      </w:pPr>
+      <w:r>
+        <w:rPr>
+          <w:rFonts w:ascii="Times New Roman" w:hAnsi="Times New Roman" w:eastAsia="Times New Roman" w:cs="Times New Roman"/>
+          <w:b/>
+          <w:i w:val="0"/>
+          <w:sz w:val="22"/>
+        </w:rPr>
+        <w:t>7 pav. DB3 - frmInventory forma duomenų įvedimui (4 laukai)</w:t>
+      </w:r>
+    </w:p>
+    <w:p>
+      <w:pPr>
+        <w:spacing w:line="240" w:lineRule="auto" w:before="0" w:after="240"/>
+        <w:ind w:firstLine="0"/>
+        <w:jc w:val="center"/>
+      </w:pPr>
+      <w:r>
+        <w:rPr>
+          <w:rFonts w:ascii="Times New Roman" w:hAnsi="Times New Roman" w:eastAsia="Times New Roman" w:cs="Times New Roman"/>
+          <w:b w:val="0"/>
+          <w:i/>
+          <w:sz w:val="18"/>
+        </w:rPr>
+        <w:t>Šaltinis: sudaryta autoriaus.</w:t>
       </w:r>
     </w:p>
     <w:p>
@@ -2851,7 +2924,80 @@
           <w:i w:val="0"/>
           <w:sz w:val="24"/>
         </w:rPr>
-        <w:t>Pakoreguota forma vartotojui suteikia daugiau verslo informacijos - matoma ne tik prekės identifikacija, bet ir komercinė informacija (kaina, kilmė, paskutinis užsakymas). Forma išbandyta tomis pačiomis operacijomis kaip ir pirma. Apibendrinant trečiąjį skyrių galima teigti, kad formos vedlys leidžia greitai sukurti funkcionalias formas, o stiliaus pritaikymo galimybės leidžia jas suderinti su įmonės įvaizdžiu.</w:t>
+        <w:t>Pakoreguota forma vartotojui suteikia daugiau verslo informacijos - matoma ne tik prekės identifikacija, bet ir komercinė informacija (kaina, kilmė, paskutinis užsakymas). Forma išbandyta tomis pačiomis operacijomis kaip ir pirma. Antrosios formos vaizdas pateiktas 8 paveiksle (žr. 8 pav.). Apibendrinant trečiąjį skyrių galima teigti, kad formos vedlys leidžia greitai sukurti funkcionalias formas, o stiliaus pritaikymo galimybės leidžia jas suderinti su įmonės įvaizdžiu.</w:t>
+      </w:r>
+    </w:p>
+    <w:p>
+      <w:pPr>
+        <w:spacing w:line="240" w:lineRule="auto" w:before="240" w:after="0"/>
+        <w:ind w:firstLine="0"/>
+        <w:jc w:val="center"/>
+      </w:pPr>
+      <w:r>
+        <w:drawing>
+          <wp:inline xmlns:a="http://schemas.openxmlformats.org/drawingml/2006/main" xmlns:pic="http://schemas.openxmlformats.org/drawingml/2006/picture">
+            <wp:extent cx="5040000" cy="4073208"/>
+            <wp:docPr id="8" name="Picture 8"/>
+            <wp:cNvGraphicFramePr>
+              <a:graphicFrameLocks noChangeAspect="1"/>
+            </wp:cNvGraphicFramePr>
+            <a:graphic>
+              <a:graphicData uri="http://schemas.openxmlformats.org/drawingml/2006/picture">
+                <pic:pic>
+                  <pic:nvPicPr>
+                    <pic:cNvPr id="0" name="img11_form_inventory_extended.png"/>
+                    <pic:cNvPicPr/>
+                  </pic:nvPicPr>
+                  <pic:blipFill>
+                    <a:blip r:embed="rId18"/>
+                    <a:stretch>
+                      <a:fillRect/>
+                    </a:stretch>
+                  </pic:blipFill>
+                  <pic:spPr>
+                    <a:xfrm>
+                      <a:off x="0" y="0"/>
+                      <a:ext cx="5040000" cy="4073208"/>
+                    </a:xfrm>
+                    <a:prstGeom prst="rect"/>
+                  </pic:spPr>
+                </pic:pic>
+              </a:graphicData>
+            </a:graphic>
+          </wp:inline>
+        </w:drawing>
+      </w:r>
+    </w:p>
+    <w:p>
+      <w:pPr>
+        <w:spacing w:line="360" w:lineRule="auto" w:before="80" w:after="0"/>
+        <w:ind w:firstLine="0"/>
+        <w:jc w:val="center"/>
+      </w:pPr>
+      <w:r>
+        <w:rPr>
+          <w:rFonts w:ascii="Times New Roman" w:hAnsi="Times New Roman" w:eastAsia="Times New Roman" w:cs="Times New Roman"/>
+          <w:b/>
+          <w:i w:val="0"/>
+          <w:sz w:val="22"/>
+        </w:rPr>
+        <w:t>8 pav. DB3 - frmInventoryExtended forma su 7 laukais</w:t>
+      </w:r>
+    </w:p>
+    <w:p>
+      <w:pPr>
+        <w:spacing w:line="240" w:lineRule="auto" w:before="0" w:after="240"/>
+        <w:ind w:firstLine="0"/>
+        <w:jc w:val="center"/>
+      </w:pPr>
+      <w:r>
+        <w:rPr>
+          <w:rFonts w:ascii="Times New Roman" w:hAnsi="Times New Roman" w:eastAsia="Times New Roman" w:cs="Times New Roman"/>
+          <w:b w:val="0"/>
+          <w:i/>
+          <w:sz w:val="18"/>
+        </w:rPr>
+        <w:t>Šaltinis: sudaryta autoriaus.</w:t>
       </w:r>
     </w:p>
     <w:p>
@@ -2983,7 +3129,7 @@
           <w:i w:val="0"/>
           <w:sz w:val="24"/>
         </w:rPr>
-        <w:t>Modifikuotos užklausos rezultatas pateiktas 7 paveiksle (žr. 7 pav.). Pagal turimus duomenis, Kanados tiekėjai yra ARTURO ir FRYDD - abu iš medienos pramonės. Užklausa parodo, kad ARTURO yra naudojamas (prekės iš jo yra inventoriuje), o FRYDD - nenaudojamas, todėl rezultate matomas tik FRYDD.</w:t>
+        <w:t>Modifikuotos užklausos rezultatas pateiktas 9 paveiksle (žr. 9 pav.). Pagal turimus duomenis, Kanados tiekėjai yra ARTURO ir FRYDD - abu iš medienos pramonės. Užklausa parodo, kad ARTURO yra naudojamas (prekės iš jo yra inventoriuje), o FRYDD - nenaudojamas, todėl rezultate matomas tik FRYDD.</w:t>
       </w:r>
     </w:p>
     <w:p>
@@ -2996,7 +3142,7 @@
         <w:drawing>
           <wp:inline xmlns:a="http://schemas.openxmlformats.org/drawingml/2006/main" xmlns:pic="http://schemas.openxmlformats.org/drawingml/2006/picture">
             <wp:extent cx="5400000" cy="1814400"/>
-            <wp:docPr id="7" name="Picture 7"/>
+            <wp:docPr id="9" name="Picture 9"/>
             <wp:cNvGraphicFramePr>
               <a:graphicFrameLocks noChangeAspect="1"/>
             </wp:cNvGraphicFramePr>
@@ -3008,7 +3154,7 @@
                     <pic:cNvPicPr/>
                   </pic:nvPicPr>
                   <pic:blipFill>
-                    <a:blip r:embed="rId17"/>
+                    <a:blip r:embed="rId19"/>
                     <a:stretch>
                       <a:fillRect/>
                     </a:stretch>
@@ -3040,7 +3186,7 @@
           <w:i w:val="0"/>
           <w:sz w:val="22"/>
         </w:rPr>
-        <w:t>7 pav. qryUnusedSuppliers (Kanada) rezultatas</w:t>
+        <w:t>9 pav. qryUnusedSuppliers (Kanada) rezultatas</w:t>
       </w:r>
     </w:p>
     <w:p>
@@ -3105,7 +3251,80 @@
           <w:i w:val="0"/>
           <w:sz w:val="24"/>
         </w:rPr>
-        <w:t>Pamėginta sukurti analogišką formą per LibreOffice Base formos vedlį. Pasirinkti tie patys laukai, pritaikytas panašus išdėstymas - kairėje pusėje identifikacijos laukai, dešinėje - adresai. Stiliaus tema parinkta neutrali (pilkos atspalviai). Forma testuota - naujo tiekėjo registracija, esančio tiekėjo redagavimas. Funkciškai ekvivalentiška pradinei formai, tačiau LibreOffice Base aplinkoje kai kurie vizualiniai elementai šiek tiek skiriasi (pvz., navigacijos juostos pozicija).</w:t>
+        <w:t>Pamėginta sukurti analogišką formą per LibreOffice Base formos vedlį. Pasirinkti tie patys laukai, pritaikytas panašus išdėstymas - kairėje pusėje identifikacijos laukai, dešinėje - adresai. Stiliaus tema parinkta neutrali (pilkos atspalviai). Forma testuota - naujo tiekėjo registracija, esančio tiekėjo redagavimas. Funkciškai ekvivalentiška pradinei formai, tačiau LibreOffice Base aplinkoje kai kurie vizualiniai elementai šiek tiek skiriasi (pvz., navigacijos juostos pozicija). Sukurtos formos vaizdas pateiktas 10 paveiksle (žr. 10 pav.).</w:t>
+      </w:r>
+    </w:p>
+    <w:p>
+      <w:pPr>
+        <w:spacing w:line="240" w:lineRule="auto" w:before="240" w:after="0"/>
+        <w:ind w:firstLine="0"/>
+        <w:jc w:val="center"/>
+      </w:pPr>
+      <w:r>
+        <w:drawing>
+          <wp:inline xmlns:a="http://schemas.openxmlformats.org/drawingml/2006/main" xmlns:pic="http://schemas.openxmlformats.org/drawingml/2006/picture">
+            <wp:extent cx="5580000" cy="3165957"/>
+            <wp:docPr id="10" name="Picture 10"/>
+            <wp:cNvGraphicFramePr>
+              <a:graphicFrameLocks noChangeAspect="1"/>
+            </wp:cNvGraphicFramePr>
+            <a:graphic>
+              <a:graphicData uri="http://schemas.openxmlformats.org/drawingml/2006/picture">
+                <pic:pic>
+                  <pic:nvPicPr>
+                    <pic:cNvPr id="0" name="img12_form_suppliers.png"/>
+                    <pic:cNvPicPr/>
+                  </pic:nvPicPr>
+                  <pic:blipFill>
+                    <a:blip r:embed="rId20"/>
+                    <a:stretch>
+                      <a:fillRect/>
+                    </a:stretch>
+                  </pic:blipFill>
+                  <pic:spPr>
+                    <a:xfrm>
+                      <a:off x="0" y="0"/>
+                      <a:ext cx="5580000" cy="3165957"/>
+                    </a:xfrm>
+                    <a:prstGeom prst="rect"/>
+                  </pic:spPr>
+                </pic:pic>
+              </a:graphicData>
+            </a:graphic>
+          </wp:inline>
+        </w:drawing>
+      </w:r>
+    </w:p>
+    <w:p>
+      <w:pPr>
+        <w:spacing w:line="360" w:lineRule="auto" w:before="80" w:after="0"/>
+        <w:ind w:firstLine="0"/>
+        <w:jc w:val="center"/>
+      </w:pPr>
+      <w:r>
+        <w:rPr>
+          <w:rFonts w:ascii="Times New Roman" w:hAnsi="Times New Roman" w:eastAsia="Times New Roman" w:cs="Times New Roman"/>
+          <w:b/>
+          <w:i w:val="0"/>
+          <w:sz w:val="22"/>
+        </w:rPr>
+        <w:t>10 pav. DB4 - frmSuppliers forma tiekėjams (dvieju stulpelių išdėstymas)</w:t>
+      </w:r>
+    </w:p>
+    <w:p>
+      <w:pPr>
+        <w:spacing w:line="240" w:lineRule="auto" w:before="0" w:after="240"/>
+        <w:ind w:firstLine="0"/>
+        <w:jc w:val="center"/>
+      </w:pPr>
+      <w:r>
+        <w:rPr>
+          <w:rFonts w:ascii="Times New Roman" w:hAnsi="Times New Roman" w:eastAsia="Times New Roman" w:cs="Times New Roman"/>
+          <w:b w:val="0"/>
+          <w:i/>
+          <w:sz w:val="18"/>
+        </w:rPr>
+        <w:t>Šaltinis: sudaryta autoriaus.</w:t>
       </w:r>
     </w:p>
     <w:p>
@@ -3188,7 +3407,7 @@
           <w:i w:val="0"/>
           <w:sz w:val="24"/>
         </w:rPr>
-        <w:t>Ataskaita rptDepartments suteikia vadovybei vaizdą apie produktų pasiskirstymą pagal skyrius. Ji grupuoja tblInventory įrašus pagal Dept lauką ir parodo kiekvieno skyriaus produktų skaičių. Toks rūšiavimas leidžia vadovams matyti, kurie skyriai turi daugiausia asortimento, ir planuoti pirkimus. Suvestinės pavyzdys pateiktas 8 paveiksle (žr. 8 pav.) - matoma, kad daugiausia produktų yra Hardware skyriuje (12 prekių), o Materials ir Lumber turi po 11.</w:t>
+        <w:t>Ataskaita rptDepartments suteikia vadovybei vaizdą apie produktų pasiskirstymą pagal skyrius. Ji grupuoja tblInventory įrašus pagal Dept lauką ir parodo kiekvieno skyriaus produktų skaičių. Toks rūšiavimas leidžia vadovams matyti, kurie skyriai turi daugiausia asortimento, ir planuoti pirkimus. Suvestinės pavyzdys pateiktas 11 paveiksle (žr. 11 pav.) - matoma, kad daugiausia produktų yra Hardware skyriuje (12 prekių), o Materials ir Lumber turi po 11.</w:t>
       </w:r>
     </w:p>
     <w:p>
@@ -3201,7 +3420,7 @@
         <w:drawing>
           <wp:inline xmlns:a="http://schemas.openxmlformats.org/drawingml/2006/main" xmlns:pic="http://schemas.openxmlformats.org/drawingml/2006/picture">
             <wp:extent cx="4320000" cy="2715429"/>
-            <wp:docPr id="8" name="Picture 8"/>
+            <wp:docPr id="11" name="Picture 11"/>
             <wp:cNvGraphicFramePr>
               <a:graphicFrameLocks noChangeAspect="1"/>
             </wp:cNvGraphicFramePr>
@@ -3213,7 +3432,7 @@
                     <pic:cNvPicPr/>
                   </pic:nvPicPr>
                   <pic:blipFill>
-                    <a:blip r:embed="rId18"/>
+                    <a:blip r:embed="rId21"/>
                     <a:stretch>
                       <a:fillRect/>
                     </a:stretch>
@@ -3245,7 +3464,7 @@
           <w:i w:val="0"/>
           <w:sz w:val="22"/>
         </w:rPr>
-        <w:t>8 pav. rptDepartments ataskaita - produktų skaičius</w:t>
+        <w:t>11 pav. rptDepartments ataskaita - produktų skaičius</w:t>
       </w:r>
     </w:p>
     <w:p>
@@ -3342,7 +3561,80 @@
           <w:i w:val="0"/>
           <w:sz w:val="24"/>
         </w:rPr>
-        <w:t>Ataskaitos struktūra padalinta į skyrius pagal šalį - JAV (USA) tiekėjai grupuojami pirmiausia, paskui Kanados, Kinijos. Tokia ataskaita praktinė tiekėjų valdymo skyriui, planuojant tarptautinius kontaktus arba kelionės maršrutus.</w:t>
+        <w:t>Ataskaitos struktūra padalinta į skyrius pagal šalį - JAV (USA) tiekėjai grupuojami pirmiausia, paskui Kanados, Kinijos. Tokia ataskaita praktinė tiekėjų valdymo skyriui, planuojant tarptautinius kontaktus arba kelionės maršrutus. Ataskaitos vaizdas pateiktas 12 paveiksle (žr. 12 pav.).</w:t>
+      </w:r>
+    </w:p>
+    <w:p>
+      <w:pPr>
+        <w:spacing w:line="240" w:lineRule="auto" w:before="240" w:after="0"/>
+        <w:ind w:firstLine="0"/>
+        <w:jc w:val="center"/>
+      </w:pPr>
+      <w:r>
+        <w:drawing>
+          <wp:inline xmlns:a="http://schemas.openxmlformats.org/drawingml/2006/main" xmlns:pic="http://schemas.openxmlformats.org/drawingml/2006/picture">
+            <wp:extent cx="5580000" cy="5032941"/>
+            <wp:docPr id="12" name="Picture 12"/>
+            <wp:cNvGraphicFramePr>
+              <a:graphicFrameLocks noChangeAspect="1"/>
+            </wp:cNvGraphicFramePr>
+            <a:graphic>
+              <a:graphicData uri="http://schemas.openxmlformats.org/drawingml/2006/picture">
+                <pic:pic>
+                  <pic:nvPicPr>
+                    <pic:cNvPr id="0" name="img13_rpt_suppliers_country.png"/>
+                    <pic:cNvPicPr/>
+                  </pic:nvPicPr>
+                  <pic:blipFill>
+                    <a:blip r:embed="rId22"/>
+                    <a:stretch>
+                      <a:fillRect/>
+                    </a:stretch>
+                  </pic:blipFill>
+                  <pic:spPr>
+                    <a:xfrm>
+                      <a:off x="0" y="0"/>
+                      <a:ext cx="5580000" cy="5032941"/>
+                    </a:xfrm>
+                    <a:prstGeom prst="rect"/>
+                  </pic:spPr>
+                </pic:pic>
+              </a:graphicData>
+            </a:graphic>
+          </wp:inline>
+        </w:drawing>
+      </w:r>
+    </w:p>
+    <w:p>
+      <w:pPr>
+        <w:spacing w:line="360" w:lineRule="auto" w:before="80" w:after="0"/>
+        <w:ind w:firstLine="0"/>
+        <w:jc w:val="center"/>
+      </w:pPr>
+      <w:r>
+        <w:rPr>
+          <w:rFonts w:ascii="Times New Roman" w:hAnsi="Times New Roman" w:eastAsia="Times New Roman" w:cs="Times New Roman"/>
+          <w:b/>
+          <w:i w:val="0"/>
+          <w:sz w:val="22"/>
+        </w:rPr>
+        <w:t>12 pav. DB5 - Tiekėjų kontaktinė ataskaita pagal šalį ir miestą</w:t>
+      </w:r>
+    </w:p>
+    <w:p>
+      <w:pPr>
+        <w:spacing w:line="240" w:lineRule="auto" w:before="0" w:after="240"/>
+        <w:ind w:firstLine="0"/>
+        <w:jc w:val="center"/>
+      </w:pPr>
+      <w:r>
+        <w:rPr>
+          <w:rFonts w:ascii="Times New Roman" w:hAnsi="Times New Roman" w:eastAsia="Times New Roman" w:cs="Times New Roman"/>
+          <w:b w:val="0"/>
+          <w:i/>
+          <w:sz w:val="18"/>
+        </w:rPr>
+        <w:t>Šaltinis: sudaryta autoriaus.</w:t>
       </w:r>
     </w:p>
     <w:p>
@@ -3375,7 +3667,80 @@
           <w:i w:val="0"/>
           <w:sz w:val="24"/>
         </w:rPr>
-        <w:t>Antra sukurta ataskaita susieja užklausą (kilmės šalis) ir inventoriaus lentelę. Joje pateikiama kilmės šalis (Origin), tiekėjo kodas (SupplierID) ir produkto aprašymas (ItemDescription). Naudojama užklausa sukurta projektavimo įrankyje: SELECT i.Origin, i.SupplierID, i.ItemDescription FROM tblInventory i ORDER BY i.Origin, i.SupplierID. Ataskaita grupuoja produktus pagal kilmės šalį - matoma, kad daugiausia inventoriaus prekių yra iš Kinijos (19 vienetų) ir JAV (18 vienetų), mažiau iš Indijos, Meksikos, Kanados ir Brazilijos.</w:t>
+        <w:t>Antra sukurta ataskaita susieja užklausą (kilmės šalis) ir inventoriaus lentelę. Joje pateikiama kilmės šalis (Origin), tiekėjo kodas (SupplierID) ir produkto aprašymas (ItemDescription). Naudojama užklausa sukurta projektavimo įrankyje: SELECT i.Origin, i.SupplierID, i.ItemDescription FROM tblInventory i ORDER BY i.Origin, i.SupplierID. Ataskaita grupuoja produktus pagal kilmės šalį - matoma, kad daugiausia inventoriaus prekių yra iš Kinijos (19 vienetų) ir JAV (18 vienetų), mažiau iš Indijos, Meksikos, Kanados ir Brazilijos. Ataskaitos vaizdas pateiktas 13 paveiksle (žr. 13 pav.).</w:t>
+      </w:r>
+    </w:p>
+    <w:p>
+      <w:pPr>
+        <w:spacing w:line="240" w:lineRule="auto" w:before="240" w:after="0"/>
+        <w:ind w:firstLine="0"/>
+        <w:jc w:val="center"/>
+      </w:pPr>
+      <w:r>
+        <w:drawing>
+          <wp:inline xmlns:a="http://schemas.openxmlformats.org/drawingml/2006/main" xmlns:pic="http://schemas.openxmlformats.org/drawingml/2006/picture">
+            <wp:extent cx="5580000" cy="8792727"/>
+            <wp:docPr id="13" name="Picture 13"/>
+            <wp:cNvGraphicFramePr>
+              <a:graphicFrameLocks noChangeAspect="1"/>
+            </wp:cNvGraphicFramePr>
+            <a:graphic>
+              <a:graphicData uri="http://schemas.openxmlformats.org/drawingml/2006/picture">
+                <pic:pic>
+                  <pic:nvPicPr>
+                    <pic:cNvPr id="0" name="img14_rpt_origin_inventory.png"/>
+                    <pic:cNvPicPr/>
+                  </pic:nvPicPr>
+                  <pic:blipFill>
+                    <a:blip r:embed="rId23"/>
+                    <a:stretch>
+                      <a:fillRect/>
+                    </a:stretch>
+                  </pic:blipFill>
+                  <pic:spPr>
+                    <a:xfrm>
+                      <a:off x="0" y="0"/>
+                      <a:ext cx="5580000" cy="8792727"/>
+                    </a:xfrm>
+                    <a:prstGeom prst="rect"/>
+                  </pic:spPr>
+                </pic:pic>
+              </a:graphicData>
+            </a:graphic>
+          </wp:inline>
+        </w:drawing>
+      </w:r>
+    </w:p>
+    <w:p>
+      <w:pPr>
+        <w:spacing w:line="360" w:lineRule="auto" w:before="80" w:after="0"/>
+        <w:ind w:firstLine="0"/>
+        <w:jc w:val="center"/>
+      </w:pPr>
+      <w:r>
+        <w:rPr>
+          <w:rFonts w:ascii="Times New Roman" w:hAnsi="Times New Roman" w:eastAsia="Times New Roman" w:cs="Times New Roman"/>
+          <w:b/>
+          <w:i w:val="0"/>
+          <w:sz w:val="22"/>
+        </w:rPr>
+        <w:t>13 pav. DB5 - Inventoriaus ataskaita pagal kilmės šalį</w:t>
+      </w:r>
+    </w:p>
+    <w:p>
+      <w:pPr>
+        <w:spacing w:line="240" w:lineRule="auto" w:before="0" w:after="240"/>
+        <w:ind w:firstLine="0"/>
+        <w:jc w:val="center"/>
+      </w:pPr>
+      <w:r>
+        <w:rPr>
+          <w:rFonts w:ascii="Times New Roman" w:hAnsi="Times New Roman" w:eastAsia="Times New Roman" w:cs="Times New Roman"/>
+          <w:b w:val="0"/>
+          <w:i/>
+          <w:sz w:val="18"/>
+        </w:rPr>
+        <w:t>Šaltinis: sudaryta autoriaus.</w:t>
       </w:r>
     </w:p>
     <w:p>
@@ -3555,7 +3920,7 @@
           <w:i w:val="0"/>
           <w:sz w:val="24"/>
         </w:rPr>
-        <w:t>Visų trijų užklausų rezultatų kombinuotas pavyzdys (skaičiavimai pagal kilmės šalį) pateiktas 9 paveiksle (žr. 9 pav.). Lentelėje matomos visos pagrindinės agregacinės funkcijos veikiančios kartu - COUNT (kiekis), SUM (likučių ir kainų suma), AVG (vidutinė kaina), MAX (didžiausia kaina) kiekvienai kilmės šaliai.</w:t>
+        <w:t>Visų trijų užklausų rezultatų kombinuotas pavyzdys (skaičiavimai pagal kilmės šalį) pateiktas 14 paveiksle (žr. 14 pav.). Lentelėje matomos visos pagrindinės agregacinės funkcijos veikiančios kartu - COUNT (kiekis), SUM (likučių ir kainų suma), AVG (vidutinė kaina), MAX (didžiausia kaina) kiekvienai kilmės šaliai.</w:t>
       </w:r>
     </w:p>
     <w:p>
@@ -3568,7 +3933,7 @@
         <w:drawing>
           <wp:inline xmlns:a="http://schemas.openxmlformats.org/drawingml/2006/main" xmlns:pic="http://schemas.openxmlformats.org/drawingml/2006/picture">
             <wp:extent cx="5580000" cy="2782356"/>
-            <wp:docPr id="9" name="Picture 9"/>
+            <wp:docPr id="14" name="Picture 14"/>
             <wp:cNvGraphicFramePr>
               <a:graphicFrameLocks noChangeAspect="1"/>
             </wp:cNvGraphicFramePr>
@@ -3580,7 +3945,7 @@
                     <pic:cNvPicPr/>
                   </pic:nvPicPr>
                   <pic:blipFill>
-                    <a:blip r:embed="rId19"/>
+                    <a:blip r:embed="rId24"/>
                     <a:stretch>
                       <a:fillRect/>
                     </a:stretch>
@@ -3612,7 +3977,7 @@
           <w:i w:val="0"/>
           <w:sz w:val="22"/>
         </w:rPr>
-        <w:t>9 pav. DB6 skaičiavimo užklausų rezultatai pagal kilmės šalį</w:t>
+        <w:t>14 pav. DB6 skaičiavimo užklausų rezultatai pagal kilmės šalį</w:t>
       </w:r>
     </w:p>
     <w:p>
@@ -3661,7 +4026,80 @@
           <w:i w:val="0"/>
           <w:sz w:val="24"/>
         </w:rPr>
-        <w:t>Pirma ataskaita - SUMA - parodo bendrą inventoriaus vertę kiekvienam tiekėjui. Ataskaitoje grupuojama pagal SupplierID, o grupės poraštėje yra =Sum([UnitsInStock]*[RetailPrice]). Galiausiai, ataskaitos poraštėje matoma bendra visų tiekėjų suma. Tokia ataskaita naudinga tiekėjų vertinimui pagal jų indėlį į bendrą inventoriaus vertę.</w:t>
+        <w:t>Pirma ataskaita - SUMA - parodo bendrą inventoriaus vertę kiekvienam tiekėjui. Ataskaitoje grupuojama pagal SupplierID, o grupės poraštėje yra =Sum([UnitsInStock]*[RetailPrice]). Galiausiai, ataskaitos poraštėje matoma bendra visų tiekėjų suma. Tokia ataskaita naudinga tiekėjų vertinimui pagal jų indėlį į bendrą inventoriaus vertę. Ataskaitos vaizdas pateiktas 15 paveiksle (žr. 15 pav.).</w:t>
+      </w:r>
+    </w:p>
+    <w:p>
+      <w:pPr>
+        <w:spacing w:line="240" w:lineRule="auto" w:before="240" w:after="0"/>
+        <w:ind w:firstLine="0"/>
+        <w:jc w:val="center"/>
+      </w:pPr>
+      <w:r>
+        <w:drawing>
+          <wp:inline xmlns:a="http://schemas.openxmlformats.org/drawingml/2006/main" xmlns:pic="http://schemas.openxmlformats.org/drawingml/2006/picture">
+            <wp:extent cx="5580000" cy="6758473"/>
+            <wp:docPr id="15" name="Picture 15"/>
+            <wp:cNvGraphicFramePr>
+              <a:graphicFrameLocks noChangeAspect="1"/>
+            </wp:cNvGraphicFramePr>
+            <a:graphic>
+              <a:graphicData uri="http://schemas.openxmlformats.org/drawingml/2006/picture">
+                <pic:pic>
+                  <pic:nvPicPr>
+                    <pic:cNvPr id="0" name="img15_rpt_sum_supplier.png"/>
+                    <pic:cNvPicPr/>
+                  </pic:nvPicPr>
+                  <pic:blipFill>
+                    <a:blip r:embed="rId25"/>
+                    <a:stretch>
+                      <a:fillRect/>
+                    </a:stretch>
+                  </pic:blipFill>
+                  <pic:spPr>
+                    <a:xfrm>
+                      <a:off x="0" y="0"/>
+                      <a:ext cx="5580000" cy="6758473"/>
+                    </a:xfrm>
+                    <a:prstGeom prst="rect"/>
+                  </pic:spPr>
+                </pic:pic>
+              </a:graphicData>
+            </a:graphic>
+          </wp:inline>
+        </w:drawing>
+      </w:r>
+    </w:p>
+    <w:p>
+      <w:pPr>
+        <w:spacing w:line="360" w:lineRule="auto" w:before="80" w:after="0"/>
+        <w:ind w:firstLine="0"/>
+        <w:jc w:val="center"/>
+      </w:pPr>
+      <w:r>
+        <w:rPr>
+          <w:rFonts w:ascii="Times New Roman" w:hAnsi="Times New Roman" w:eastAsia="Times New Roman" w:cs="Times New Roman"/>
+          <w:b/>
+          <w:i w:val="0"/>
+          <w:sz w:val="22"/>
+        </w:rPr>
+        <w:t>15 pav. DB6 - SUM ataskaita: inventoriaus vertė pagal tiekėjus</w:t>
+      </w:r>
+    </w:p>
+    <w:p>
+      <w:pPr>
+        <w:spacing w:line="240" w:lineRule="auto" w:before="0" w:after="240"/>
+        <w:ind w:firstLine="0"/>
+        <w:jc w:val="center"/>
+      </w:pPr>
+      <w:r>
+        <w:rPr>
+          <w:rFonts w:ascii="Times New Roman" w:hAnsi="Times New Roman" w:eastAsia="Times New Roman" w:cs="Times New Roman"/>
+          <w:b w:val="0"/>
+          <w:i/>
+          <w:sz w:val="18"/>
+        </w:rPr>
+        <w:t>Šaltinis: sudaryta autoriaus.</w:t>
       </w:r>
     </w:p>
     <w:p>
@@ -3677,7 +4115,80 @@
           <w:i w:val="0"/>
           <w:sz w:val="24"/>
         </w:rPr>
-        <w:t>Antra ataskaita - VIDURKIS - rodo vidutinę produkto kainą pagal skyrių. Naudojama išraiška =Avg([RetailPrice]) grupės poraštėje. Ataskaita padeda vadovybei suprasti, kuriuose skyriuose vidutinis kainų lygis yra aukštesnis arba žemesnis - tai svarbu kainų strategijai planuoti.</w:t>
+        <w:t>Antra ataskaita - VIDURKIS - rodo vidutinę produkto kainą pagal skyrių. Naudojama išraiška =Avg([RetailPrice]) grupės poraštėje. Ataskaita padeda vadovybei suprasti, kuriuose skyriuose vidutinis kainų lygis yra aukštesnis arba žemesnis - tai svarbu kainų strategijai planuoti. Ataskaitos vaizdas pateiktas 16 paveiksle (žr. 16 pav.).</w:t>
+      </w:r>
+    </w:p>
+    <w:p>
+      <w:pPr>
+        <w:spacing w:line="240" w:lineRule="auto" w:before="240" w:after="0"/>
+        <w:ind w:firstLine="0"/>
+        <w:jc w:val="center"/>
+      </w:pPr>
+      <w:r>
+        <w:drawing>
+          <wp:inline xmlns:a="http://schemas.openxmlformats.org/drawingml/2006/main" xmlns:pic="http://schemas.openxmlformats.org/drawingml/2006/picture">
+            <wp:extent cx="5580000" cy="6962799"/>
+            <wp:docPr id="16" name="Picture 16"/>
+            <wp:cNvGraphicFramePr>
+              <a:graphicFrameLocks noChangeAspect="1"/>
+            </wp:cNvGraphicFramePr>
+            <a:graphic>
+              <a:graphicData uri="http://schemas.openxmlformats.org/drawingml/2006/picture">
+                <pic:pic>
+                  <pic:nvPicPr>
+                    <pic:cNvPr id="0" name="img16_rpt_avg_dept.png"/>
+                    <pic:cNvPicPr/>
+                  </pic:nvPicPr>
+                  <pic:blipFill>
+                    <a:blip r:embed="rId26"/>
+                    <a:stretch>
+                      <a:fillRect/>
+                    </a:stretch>
+                  </pic:blipFill>
+                  <pic:spPr>
+                    <a:xfrm>
+                      <a:off x="0" y="0"/>
+                      <a:ext cx="5580000" cy="6962799"/>
+                    </a:xfrm>
+                    <a:prstGeom prst="rect"/>
+                  </pic:spPr>
+                </pic:pic>
+              </a:graphicData>
+            </a:graphic>
+          </wp:inline>
+        </w:drawing>
+      </w:r>
+    </w:p>
+    <w:p>
+      <w:pPr>
+        <w:spacing w:line="360" w:lineRule="auto" w:before="80" w:after="0"/>
+        <w:ind w:firstLine="0"/>
+        <w:jc w:val="center"/>
+      </w:pPr>
+      <w:r>
+        <w:rPr>
+          <w:rFonts w:ascii="Times New Roman" w:hAnsi="Times New Roman" w:eastAsia="Times New Roman" w:cs="Times New Roman"/>
+          <w:b/>
+          <w:i w:val="0"/>
+          <w:sz w:val="22"/>
+        </w:rPr>
+        <w:t>16 pav. DB6 - AVG ataskaita: vidutinė kaina pagal skyrius</w:t>
+      </w:r>
+    </w:p>
+    <w:p>
+      <w:pPr>
+        <w:spacing w:line="240" w:lineRule="auto" w:before="0" w:after="240"/>
+        <w:ind w:firstLine="0"/>
+        <w:jc w:val="center"/>
+      </w:pPr>
+      <w:r>
+        <w:rPr>
+          <w:rFonts w:ascii="Times New Roman" w:hAnsi="Times New Roman" w:eastAsia="Times New Roman" w:cs="Times New Roman"/>
+          <w:b w:val="0"/>
+          <w:i/>
+          <w:sz w:val="18"/>
+        </w:rPr>
+        <w:t>Šaltinis: sudaryta autoriaus.</w:t>
       </w:r>
     </w:p>
     <w:p>
@@ -3693,7 +4204,80 @@
           <w:i w:val="0"/>
           <w:sz w:val="24"/>
         </w:rPr>
-        <w:t>Trečia ataskaita - MAKSIMALI REIKŠMĖ - parodo brangiausią produktą kiekvienoje kilmės šalyje. Naudojama =Max([RetailPrice]) išraiška. Ataskaita kainų lyginamajai analizei tarptautiniu mastu - matoma, ar konkrečios šalies produkcija turi premium segmento prekių, ar tik bazines.</w:t>
+        <w:t>Trečia ataskaita - MAKSIMALI REIKŠMĖ - parodo brangiausią produktą kiekvienoje kilmės šalyje. Naudojama =Max([RetailPrice]) išraiška. Ataskaita kainų lyginamajai analizei tarptautiniu mastu - matoma, ar konkrečios šalies produkcija turi premium segmento prekių, ar tik bazines. Ataskaitos vaizdas pateiktas 17 paveiksle (žr. 17 pav.).</w:t>
+      </w:r>
+    </w:p>
+    <w:p>
+      <w:pPr>
+        <w:spacing w:line="240" w:lineRule="auto" w:before="240" w:after="0"/>
+        <w:ind w:firstLine="0"/>
+        <w:jc w:val="center"/>
+      </w:pPr>
+      <w:r>
+        <w:drawing>
+          <wp:inline xmlns:a="http://schemas.openxmlformats.org/drawingml/2006/main" xmlns:pic="http://schemas.openxmlformats.org/drawingml/2006/picture">
+            <wp:extent cx="5580000" cy="5119794"/>
+            <wp:docPr id="17" name="Picture 17"/>
+            <wp:cNvGraphicFramePr>
+              <a:graphicFrameLocks noChangeAspect="1"/>
+            </wp:cNvGraphicFramePr>
+            <a:graphic>
+              <a:graphicData uri="http://schemas.openxmlformats.org/drawingml/2006/picture">
+                <pic:pic>
+                  <pic:nvPicPr>
+                    <pic:cNvPr id="0" name="img17_rpt_max_origin.png"/>
+                    <pic:cNvPicPr/>
+                  </pic:nvPicPr>
+                  <pic:blipFill>
+                    <a:blip r:embed="rId27"/>
+                    <a:stretch>
+                      <a:fillRect/>
+                    </a:stretch>
+                  </pic:blipFill>
+                  <pic:spPr>
+                    <a:xfrm>
+                      <a:off x="0" y="0"/>
+                      <a:ext cx="5580000" cy="5119794"/>
+                    </a:xfrm>
+                    <a:prstGeom prst="rect"/>
+                  </pic:spPr>
+                </pic:pic>
+              </a:graphicData>
+            </a:graphic>
+          </wp:inline>
+        </w:drawing>
+      </w:r>
+    </w:p>
+    <w:p>
+      <w:pPr>
+        <w:spacing w:line="360" w:lineRule="auto" w:before="80" w:after="0"/>
+        <w:ind w:firstLine="0"/>
+        <w:jc w:val="center"/>
+      </w:pPr>
+      <w:r>
+        <w:rPr>
+          <w:rFonts w:ascii="Times New Roman" w:hAnsi="Times New Roman" w:eastAsia="Times New Roman" w:cs="Times New Roman"/>
+          <w:b/>
+          <w:i w:val="0"/>
+          <w:sz w:val="22"/>
+        </w:rPr>
+        <w:t>17 pav. DB6 - MAX ataskaita: brangiausias produktas pagal kilmę</w:t>
+      </w:r>
+    </w:p>
+    <w:p>
+      <w:pPr>
+        <w:spacing w:line="240" w:lineRule="auto" w:before="0" w:after="240"/>
+        <w:ind w:firstLine="0"/>
+        <w:jc w:val="center"/>
+      </w:pPr>
+      <w:r>
+        <w:rPr>
+          <w:rFonts w:ascii="Times New Roman" w:hAnsi="Times New Roman" w:eastAsia="Times New Roman" w:cs="Times New Roman"/>
+          <w:b w:val="0"/>
+          <w:i/>
+          <w:sz w:val="18"/>
+        </w:rPr>
+        <w:t>Šaltinis: sudaryta autoriaus.</w:t>
       </w:r>
     </w:p>
     <w:p>

</xml_diff>